<commit_message>
docs: cierra NO-FIT-011 (reemplazos, aprobación del gerente e IT, laptops compartidas)
Co-Authored-By: Claude Opus 5.5 <noreply@anthropic.com>
Claude-Session: https://claude.ai/code/session_01XRB1wz51wcF3Yrg4VK8DGc
</commit_message>
<xml_diff>
--- a/revision-2026/word/NO-FIT-011 Solicitud de Equipo de Computo.docx
+++ b/revision-2026/word/NO-FIT-011 Solicitud de Equipo de Computo.docx
@@ -35,23 +35,17 @@
         </w:numPr>
       </w:pPr>
       <w:r>
-        <w:t xml:space="preserve">El</w:t>
-      </w:r>
-      <w:r>
-        <w:t xml:space="preserve"> </w:t>
-      </w:r>
-      <w:r>
         <w:rPr>
           <w:b/>
           <w:bCs/>
         </w:rPr>
-        <w:t xml:space="preserve">gerente del área</w:t>
+        <w:t xml:space="preserve">Cualquier persona del área</w:t>
       </w:r>
       <w:r>
         <w:t xml:space="preserve"> </w:t>
       </w:r>
       <w:r>
-        <w:t xml:space="preserve">llena este formato en Word.</w:t>
+        <w:t xml:space="preserve">puede llenar este formato en Word.</w:t>
       </w:r>
     </w:p>
     <w:p>
@@ -90,7 +84,35 @@
           <w:b/>
           <w:bCs/>
         </w:rPr>
-        <w:t xml:space="preserve">El correo del gerente del área es la autorización.</w:t>
+        <w:t xml:space="preserve">Si quien lo pide no es el gerente del área, el gerente tiene que aprobarlo:</w:t>
+      </w:r>
+      <w:r>
+        <w:t xml:space="preserve"> </w:t>
+      </w:r>
+      <w:r>
+        <w:t xml:space="preserve">se le copia el correo y responde aprobando. Sin la aprobación del gerente, IT no procesa la solicitud.</w:t>
+      </w:r>
+    </w:p>
+    <w:p>
+      <w:pPr>
+        <w:pStyle w:val="Compact"/>
+        <w:numPr>
+          <w:ilvl w:val="0"/>
+          <w:numId w:val="1001"/>
+        </w:numPr>
+      </w:pPr>
+      <w:r>
+        <w:rPr>
+          <w:b/>
+          <w:bCs/>
+        </w:rPr>
+        <w:t xml:space="preserve">IT Administration evalúa la solicitud y la aprueba o la niega.</w:t>
+      </w:r>
+      <w:r>
+        <w:t xml:space="preserve"> </w:t>
+      </w:r>
+      <w:r>
+        <w:t xml:space="preserve">Si la niega, explica el motivo en la sección 7.</w:t>
       </w:r>
     </w:p>
     <w:p>
@@ -186,6 +208,46 @@
               <w:pStyle w:val="Compact"/>
             </w:pPr>
             <w:r>
+              <w:t xml:space="preserve">Solicita (nombre):</w:t>
+            </w:r>
+          </w:p>
+        </w:tc>
+        <w:tc>
+          <w:tcPr/>
+          <w:p>
+            <w:pPr>
+              <w:pStyle w:val="Compact"/>
+            </w:pPr>
+          </w:p>
+        </w:tc>
+        <w:tc>
+          <w:tcPr/>
+          <w:p>
+            <w:pPr>
+              <w:pStyle w:val="Compact"/>
+            </w:pPr>
+            <w:r>
+              <w:t xml:space="preserve">Puesto:</w:t>
+            </w:r>
+          </w:p>
+        </w:tc>
+        <w:tc>
+          <w:tcPr/>
+          <w:p>
+            <w:pPr>
+              <w:pStyle w:val="Compact"/>
+            </w:pPr>
+          </w:p>
+        </w:tc>
+      </w:tr>
+      <w:tr>
+        <w:tc>
+          <w:tcPr/>
+          <w:p>
+            <w:pPr>
+              <w:pStyle w:val="Compact"/>
+            </w:pPr>
+            <w:r>
               <w:t xml:space="preserve">Gerente del área:</w:t>
             </w:r>
           </w:p>
@@ -340,6 +402,28 @@
       </w:r>
       <w:r>
         <w:t xml:space="preserve">(por ejemplo, un segundo monitor). Usuario: ______________ · Número de empleado: ______</w:t>
+      </w:r>
+      <w:r>
+        <w:t xml:space="preserve"> </w:t>
+      </w:r>
+      <w:r>
+        <w:t xml:space="preserve">☐</w:t>
+      </w:r>
+      <w:r>
+        <w:t xml:space="preserve"> </w:t>
+      </w:r>
+      <w:r>
+        <w:rPr>
+          <w:b/>
+          <w:bCs/>
+        </w:rPr>
+        <w:t xml:space="preserve">Reemplazo de un equipo</w:t>
+      </w:r>
+      <w:r>
+        <w:t xml:space="preserve"> </w:t>
+      </w:r>
+      <w:r>
+        <w:t xml:space="preserve">(llenar la sección 5).</w:t>
       </w:r>
     </w:p>
     <w:p>
@@ -894,34 +978,17 @@
           <w:b/>
           <w:bCs/>
         </w:rPr>
-        <w:t xml:space="preserve">5. ¿Por qué se necesita?</w:t>
-      </w:r>
-    </w:p>
-    <w:p>
-      <w:pPr>
-        <w:pStyle w:val="BodyText"/>
-      </w:pPr>
-      <w:r>
-        <w:t xml:space="preserve"> </w:t>
-      </w:r>
-    </w:p>
-    <w:p>
-      <w:r>
-        <w:pict>
-          <v:rect style="width:0;height:1.5pt" o:hralign="center" o:hrstd="t" o:hr="t"/>
-        </w:pict>
-      </w:r>
-    </w:p>
-    <w:p>
-      <w:pPr>
-        <w:pStyle w:val="FirstParagraph"/>
-      </w:pPr>
+        <w:t xml:space="preserve">5. Reemplazo</w:t>
+      </w:r>
+      <w:r>
+        <w:t xml:space="preserve"> </w:t>
+      </w:r>
       <w:r>
         <w:rPr>
-          <w:b/>
-          <w:bCs/>
+          <w:i/>
+          <w:iCs/>
         </w:rPr>
-        <w:t xml:space="preserve">6. Uso exclusivo de IT</w:t>
+        <w:t xml:space="preserve">(solo si se marcó "Reemplazo")</w:t>
       </w:r>
     </w:p>
     <w:tbl>
@@ -952,6 +1019,166 @@
             <w:pPr>
               <w:pStyle w:val="Compact"/>
             </w:pPr>
+            <w:r>
+              <w:t xml:space="preserve">Asset ID del equipo a reemplazar:</w:t>
+            </w:r>
+          </w:p>
+        </w:tc>
+        <w:tc>
+          <w:tcPr/>
+          <w:p>
+            <w:pPr>
+              <w:pStyle w:val="Compact"/>
+            </w:pPr>
+          </w:p>
+        </w:tc>
+      </w:tr>
+      <w:tr>
+        <w:tc>
+          <w:tcPr/>
+          <w:p>
+            <w:pPr>
+              <w:pStyle w:val="Compact"/>
+            </w:pPr>
+            <w:r>
+              <w:t xml:space="preserve">Usuario o área que lo usa:</w:t>
+            </w:r>
+          </w:p>
+        </w:tc>
+        <w:tc>
+          <w:tcPr/>
+          <w:p>
+            <w:pPr>
+              <w:pStyle w:val="Compact"/>
+            </w:pPr>
+          </w:p>
+        </w:tc>
+      </w:tr>
+      <w:tr>
+        <w:tc>
+          <w:tcPr/>
+          <w:p>
+            <w:pPr>
+              <w:pStyle w:val="Compact"/>
+            </w:pPr>
+            <w:r>
+              <w:t xml:space="preserve">Motivo:</w:t>
+            </w:r>
+          </w:p>
+        </w:tc>
+        <w:tc>
+          <w:tcPr/>
+          <w:p>
+            <w:pPr>
+              <w:pStyle w:val="Compact"/>
+            </w:pPr>
+            <w:r>
+              <w:t xml:space="preserve">☐ Falla ☐ Lento u obsoleto para el trabajo actual ☐ Daño físico ☐ Otro: ______</w:t>
+            </w:r>
+          </w:p>
+        </w:tc>
+      </w:tr>
+      <w:tr>
+        <w:tc>
+          <w:tcPr/>
+          <w:p>
+            <w:pPr>
+              <w:pStyle w:val="Compact"/>
+            </w:pPr>
+            <w:r>
+              <w:t xml:space="preserve">Describe el problema:</w:t>
+            </w:r>
+          </w:p>
+        </w:tc>
+        <w:tc>
+          <w:tcPr/>
+          <w:p>
+            <w:pPr>
+              <w:pStyle w:val="Compact"/>
+            </w:pPr>
+          </w:p>
+        </w:tc>
+      </w:tr>
+    </w:tbl>
+    <w:p>
+      <w:pPr>
+        <w:pStyle w:val="BodyText"/>
+      </w:pPr>
+      <w:r>
+        <w:rPr>
+          <w:i/>
+          <w:iCs/>
+        </w:rPr>
+        <w:t xml:space="preserve">El equipo reemplazado se devuelve a IT con el acta NO-FIT-002, sección 7. IT decide su destino: reasignar, reparar o dar de baja.</w:t>
+      </w:r>
+    </w:p>
+    <w:p>
+      <w:pPr>
+        <w:pStyle w:val="BodyText"/>
+      </w:pPr>
+      <w:r>
+        <w:rPr>
+          <w:b/>
+          <w:bCs/>
+        </w:rPr>
+        <w:t xml:space="preserve">6. ¿Por qué se necesita?</w:t>
+      </w:r>
+    </w:p>
+    <w:p>
+      <w:pPr>
+        <w:pStyle w:val="BodyText"/>
+      </w:pPr>
+      <w:r>
+        <w:t xml:space="preserve"> </w:t>
+      </w:r>
+    </w:p>
+    <w:p>
+      <w:r>
+        <w:pict>
+          <v:rect style="width:0;height:1.5pt" o:hralign="center" o:hrstd="t" o:hr="t"/>
+        </w:pict>
+      </w:r>
+    </w:p>
+    <w:p>
+      <w:pPr>
+        <w:pStyle w:val="FirstParagraph"/>
+      </w:pPr>
+      <w:r>
+        <w:rPr>
+          <w:b/>
+          <w:bCs/>
+        </w:rPr>
+        <w:t xml:space="preserve">7. Uso exclusivo de IT</w:t>
+      </w:r>
+    </w:p>
+    <w:tbl>
+      <w:tblPr>
+        <w:tblStyle w:val="Table"/>
+        <w:tblW w:type="auto" w:w="0"/>
+        <w:tblBorders>
+          <w:top w:val="single" w:sz="4" w:space="0" w:color="808080"/>
+          <w:left w:val="single" w:sz="4" w:space="0" w:color="808080"/>
+          <w:bottom w:val="single" w:sz="4" w:space="0" w:color="808080"/>
+          <w:right w:val="single" w:sz="4" w:space="0" w:color="808080"/>
+          <w:insideH w:val="single" w:sz="4" w:space="0" w:color="808080"/>
+          <w:insideV w:val="single" w:sz="4" w:space="0" w:color="808080"/>
+        </w:tblBorders>
+        <w:tblLook w:firstRow="1" w:lastRow="0" w:firstColumn="0" w:lastColumn="0" w:noHBand="0" w:noVBand="0" w:val="0020"/>
+      </w:tblPr>
+      <w:tblGrid>
+        <w:gridCol w:w="3960"/>
+        <w:gridCol w:w="3960"/>
+      </w:tblGrid>
+      <w:tr>
+        <w:trPr>
+          <w:tblHeader w:val="on"/>
+        </w:trPr>
+        <w:tc>
+          <w:tcPr/>
+          <w:p>
+            <w:pPr>
+              <w:pStyle w:val="Compact"/>
+            </w:pPr>
           </w:p>
         </w:tc>
         <w:tc>
@@ -981,6 +1208,71 @@
             <w:pPr>
               <w:pStyle w:val="Compact"/>
             </w:pPr>
+          </w:p>
+        </w:tc>
+      </w:tr>
+      <w:tr>
+        <w:tc>
+          <w:tcPr/>
+          <w:p>
+            <w:pPr>
+              <w:pStyle w:val="Compact"/>
+            </w:pPr>
+            <w:r>
+              <w:t xml:space="preserve">Aprobación del gerente del área</w:t>
+            </w:r>
+            <w:r>
+              <w:t xml:space="preserve"> </w:t>
+            </w:r>
+            <w:r>
+              <w:rPr>
+                <w:i/>
+                <w:iCs/>
+              </w:rPr>
+              <w:t xml:space="preserve">(si no fue quien lo pidió)</w:t>
+            </w:r>
+            <w:r>
+              <w:t xml:space="preserve">:</w:t>
+            </w:r>
+          </w:p>
+        </w:tc>
+        <w:tc>
+          <w:tcPr/>
+          <w:p>
+            <w:pPr>
+              <w:pStyle w:val="Compact"/>
+            </w:pPr>
+            <w:r>
+              <w:t xml:space="preserve">☐ Sí · Fecha: ☐ N/A</w:t>
+            </w:r>
+          </w:p>
+        </w:tc>
+      </w:tr>
+      <w:tr>
+        <w:tc>
+          <w:tcPr/>
+          <w:p>
+            <w:pPr>
+              <w:pStyle w:val="Compact"/>
+            </w:pPr>
+            <w:r>
+              <w:rPr>
+                <w:b/>
+                <w:bCs/>
+              </w:rPr>
+              <w:t xml:space="preserve">Decisión de IT Administration:</w:t>
+            </w:r>
+          </w:p>
+        </w:tc>
+        <w:tc>
+          <w:tcPr/>
+          <w:p>
+            <w:pPr>
+              <w:pStyle w:val="Compact"/>
+            </w:pPr>
+            <w:r>
+              <w:t xml:space="preserve">☐ Aprobada ☐ Negada · Motivo:</w:t>
+            </w:r>
           </w:p>
         </w:tc>
       </w:tr>
@@ -1086,6 +1378,30 @@
             </w:pPr>
             <w:r>
               <w:t xml:space="preserve">Fecha:</w:t>
+            </w:r>
+          </w:p>
+        </w:tc>
+      </w:tr>
+      <w:tr>
+        <w:tc>
+          <w:tcPr/>
+          <w:p>
+            <w:pPr>
+              <w:pStyle w:val="Compact"/>
+            </w:pPr>
+            <w:r>
+              <w:t xml:space="preserve">Equipo reemplazado devuelto (NO-FIT-002, sección 7) y destino:</w:t>
+            </w:r>
+          </w:p>
+        </w:tc>
+        <w:tc>
+          <w:tcPr/>
+          <w:p>
+            <w:pPr>
+              <w:pStyle w:val="Compact"/>
+            </w:pPr>
+            <w:r>
+              <w:t xml:space="preserve">Fecha: · ☐ Reasignar ☐ Reparar ☐ Baja ☐ N/A</w:t>
             </w:r>
           </w:p>
         </w:tc>

</xml_diff>